<commit_message>
fix(oos-262080): update ALA reading analyst role and ETX-260914-0487 gram stain results
</commit_message>
<xml_diff>
--- a/scratch/OOS-262080 Optimal Balance Pharmacy (E19193) - Celsis.docx
+++ b/scratch/OOS-262080 Optimal Balance Pharmacy (E19193) - Celsis.docx
@@ -177,7 +177,7 @@
                 <w:sz w:val="22"/>
                 <w:szCs w:val="22"/>
               </w:rPr>
-              <w:t xml:space="preserve">Gabrielle Surber (Written by: Qiyue Chen)</w:t>
+              <w:t xml:space="preserve">America Alanis (Written by: Qiyue Chen)</w:t>
             </w:r>
           </w:p>
         </w:tc>
@@ -579,7 +579,7 @@
               <w:br/>
               <w:t xml:space="preserve">Reading Analyst:</w:t>
               <w:br/>
-              <w:t xml:space="preserve">Cuong Du (CCD)</w:t>
+              <w:t xml:space="preserve">America Alanis (ALA)</w:t>
             </w:r>
           </w:p>
           <w:p>
@@ -9893,7 +9893,7 @@
               <w:br/>
               <w:t xml:space="preserve"/>
               <w:br/>
-              <w:t xml:space="preserve">Upon completion of incubation on 08 Sep 2026, TSB  FTM bottles for ETX-260828-0527 were disinfected and transferred to the intermediate ISO 7 buffer room (114A) for the aliquoting step per MICRO-SOP-44 (Celsis Sterility Testing). In 114A, the media bottles were disinfected one more time before transferring them to the ISO 5 BSC E001798 located in cleanroom 114A. In ISO 5 BSC E001798, the sample was aliquoted into assay cuvettes by analyst Cuong Du (CCD). After aliquoting, Celsis Sterility Reading was performed in accordance with MICRO-SOP-44 on Celsis instrument E002222 by analyst Cuong Du (CCD).</w:t>
+              <w:t xml:space="preserve">Upon completion of incubation on 08 Sep 2026, TSB  FTM bottles for ETX-260828-0527 were disinfected and transferred to the intermediate ISO 7 buffer room (114A) for the aliquoting step per MICRO-SOP-44 (Celsis Sterility Testing). In 114A, the media bottles were disinfected one more time before transferring them to the ISO 5 BSC E001798 located in cleanroom 114A. In ISO 5 BSC E001798, the sample was aliquoted into assay cuvettes by analyst Cuong Du (CCD). After aliquoting, Celsis Sterility Reading was performed in accordance with MICRO-SOP-44 on Celsis instrument E002222 by analyst America Alanis (ALA).</w:t>
               <w:br/>
               <w:t xml:space="preserve"/>
               <w:br/>
@@ -9929,7 +9929,7 @@
               <w:br/>
               <w:t xml:space="preserve"/>
               <w:br/>
-              <w:t xml:space="preserve">Weekly active air sampling of Cleanroom Suite 114 was performed for both the week of processing (04Sep2026) and the week of aliquoting (10Sep2026). On 04Sep2026 (performed by ISS), 1 CFU was recovered from the outermost ISO 8 anteroom (114) under ETX-260914-0487 (identification pending), while the intermediate ISO 7 buffer room (114A) and innermost ISO 7 cleanroom (114B) showed no microbial recovery (0 CFU). Similarly, on 10Sep2026 (performed by SMO), 1 CFU was recovered from the outermost ISO 8 anteroom (114) under ETX-260921-0520 (identification pending), with 0 CFU in both ISO 7 cleanrooms 114A and 114B. Weekly surface sampling across Suite 114 on both 04Sep2026 and 10Sep2026 demonstrated no microbial recovery (0 CFU) across all evaluated locations (Table 114, Cart 114, Cart 114A, Floor 114A, Cart 114B, Floor 114B).</w:t>
+              <w:t xml:space="preserve">Weekly active air sampling of Cleanroom Suite 114 was performed for both the week of processing (04Sep2026) and the week of aliquoting (10Sep2026). On 04Sep2026 (performed by ISS), 1 CFU was recovered from the outermost ISO 8 anteroom (114) under ETX-260914-0487 (characterized as Gram (+) coccobacilli and Gram (+) rods), while the intermediate ISO 7 buffer room (114A) and innermost ISO 7 cleanroom (114B) showed no microbial recovery (0 CFU). Similarly, on 10Sep2026 (performed by SMO), 1 CFU was recovered from the outermost ISO 8 anteroom (114) under ETX-260921-0520 (identification pending), with 0 CFU in both ISO 7 cleanrooms 114A and 114B. Weekly surface sampling across Suite 114 on both 04Sep2026 and 10Sep2026 demonstrated no microbial recovery (0 CFU) across all evaluated locations (Table 114, Cart 114, Cart 114A, Floor 114A, Cart 114B, Floor 114B).</w:t>
               <w:br/>
               <w:t xml:space="preserve"/>
               <w:br/>
@@ -9937,7 +9937,7 @@
               <w:br/>
               <w:t xml:space="preserve"/>
               <w:br/>
-              <w:t xml:space="preserve">The complete absence of microbial recovery from analyst glove plates, settling plates, and ISO 5 critical work surfaces throughout both processing and aliquoting indicates that no identifiable contamination transfer pathway existed between the room environment and the ISO 5 processing areas. Therefore, based on the absence of microbial recovery within the critical ISO 5 processing environments, satisfactory environmental monitoring results for personnel and critical surfaces, and the controlled processing conditions maintained throughout testing, the analyst or cleanroom environment is not considered a likely source of contamination for the sample.</w:t>
+              <w:t xml:space="preserve">The complete absence of microbial recovery from analyst glove plates, settling plates, and ISO 5 critical work surfaces throughout both processing and aliquoting indicates that no identifiable contamination transfer pathway existed between the room environment and the ISO 5 processing areas. Furthermore, the subculture of positive sample ETX-260828-0527 under ETX-260908-0593 yielded no microbial growth (0 CFU) with no cellular morphology visualized during differential staining. Therefore, based on the absence of microbial recovery within the critical ISO 5 processing environments, satisfactory environmental monitoring results for personnel and critical surfaces, and the controlled processing conditions maintained throughout testing, the analyst or cleanroom environment is not considered a likely source of contamination for the sample.</w:t>
               <w:br/>
               <w:t xml:space="preserve"/>
               <w:br/>
@@ -11377,7 +11377,7 @@
                 <w:sz w:val="14"/>
                 <w:szCs w:val="14"/>
               </w:rPr>
-              <w:t xml:space="preserve">Cuong Du</w:t>
+              <w:t xml:space="preserve">America Alanis</w:t>
             </w:r>
           </w:p>
         </w:tc>

</xml_diff>

<commit_message>
refactor(oos-262080): apply ChatGPT evidence-based scientific reasoning and regulatory language
</commit_message>
<xml_diff>
--- a/scratch/OOS-262080 Optimal Balance Pharmacy (E19193) - Celsis.docx
+++ b/scratch/OOS-262080 Optimal Balance Pharmacy (E19193) - Celsis.docx
@@ -9873,7 +9873,7 @@
               <w:br/>
               <w:t xml:space="preserve"/>
               <w:br/>
-              <w:t xml:space="preserve">Upon arrival, the sample was stored in accordance with the Client’s instructions. Both the sample prepping analyst - Andrew Carrillo (AC) - and the processing analyst - Gabrielle Surber (GS) - verified the sample's integrity throughout both the preparation and processing stages. No leaks or turbidity were observed at any point, verifying the integrity of the sample.</w:t>
+              <w:t xml:space="preserve">Upon arrival, the sample was stored in accordance with the Client’s instructions. Both the sample prepping analyst - Andrew Carrillo (AC) - and the processing analyst - Gabrielle Surber (GS) - inspected the sample during preparation and processing. No leaks or visible turbidity were observed during preparation or processing; no evidence of compromised container integrity was identified during these observations.</w:t>
               <w:br/>
               <w:t xml:space="preserve"/>
               <w:br/>
@@ -9897,11 +9897,11 @@
               <w:br/>
               <w:t xml:space="preserve"/>
               <w:br/>
-              <w:t xml:space="preserve">Following the reading, sample ETX-260828-0527 was found to yield positive readings in two of the 300mL FTM media jars (jars #3 and #5). The average Relative Luminescence Units (RLU) from the duplicate reading tubes, originating from the FTM sample jars, yielded 7190 RLU, which exceeded the negative control cutoff (FTM negative control = 985 RLU), confirming a positive result. The TSB media jars tested negative with an RLU of 1500 (TSB cutoff = 2007 RLU, negative control = 669 RLU). All other FTM and TSB sample bottles in the same batch tested negative. The %CV from the duplicate reading tubes was within specification ( 30%). Additionally, all Daily Controls, including the Instrument Blank, Reagent Blank, and ATP Positive Control, were within the defined specifications, each with a %CV below 30%.</w:t>
+              <w:t xml:space="preserve">Celsis testing produced a positive result for FTM sample container ETX-260828-0527-3/5 in accordance with the predefined decision criteria specified in MICRO-SOP-44. The FTM sample yielded 7190 RLU, which exceeded the method cutoff of 2955 RLU (FTM negative control = 985 RLU). The corresponding TSB sample container (ETX-260828-0527-4/5) tested negative with 1500 RLU (TSB cutoff = 2007 RLU, negative control = 669 RLU). Duplicate readings met the method-defined %CV criterion of  30%. Furthermore, the Daily Controls—including the Instrument Blank, Reagent Blank, and ATP Positive Control (Positive Cut-off RLU = 102383)—met their respective predefined acceptance criteria with %CV below 30% as documented in the associated Celsis data packet.</w:t>
               <w:br/>
               <w:t xml:space="preserve"/>
               <w:br/>
-              <w:t xml:space="preserve">Following the OOS result, the positive FTM bottles for ETX-260828-0527 were submitted for Differential Staining and Microbial Identification under ETX-260908-0593. No microbial growth was recovered from the subculture (0 CFU on plate, see Table 1), and differential staining was inconclusive as no cell morphology could be visualized, indicating that the microorganism present in the sample was potentially viable but not culturable.</w:t>
+              <w:t xml:space="preserve">Following the OOS result, the positive FTM bottle for ETX-260828-0527 was submitted for Differential Staining and Microbial Identification under ETX-260908-0593. No microbial growth was recovered by subculture (0 CFU on plate; see Table 1), and no cellular morphology was visualized by differential staining. Therefore, no organism was recovered for identification or further microbiological comparison. The lack of recovery on subculture does not invalidate the initial analytical Celsis result and may be consistent with low-level, stressed, or otherwise non-recoverable microbial cells under the test conditions; however, a specific microbial physiological state, including a viable but non-culturable (VBNC) state, could not be confirmed.</w:t>
               <w:br/>
               <w:t xml:space="preserve"/>
               <w:br/>
@@ -9909,7 +9909,7 @@
               <w:br/>
               <w:t xml:space="preserve"/>
               <w:br/>
-              <w:t xml:space="preserve">Monthly cleaning and disinfection of the outermost ISO 8 Anteroom, the middle ISO 7 Buffer room, the innermost ISO 7 cleanroom, and its containing ISO 5 Biosafety Cabinets for Cleanroom 114 was performed on 30 Aug 2026, as per MICRO-SOP-9 (Cleaning and Disinfecting Procedure for Microbiology). During cleaning, it was documented that all H₂O₂ indicators passed. This confirms the efficient monthly cleaning of all three parts of Cleanroom 114.</w:t>
+              <w:t xml:space="preserve">Monthly cleaning and disinfection of the outermost ISO 8 Anteroom, the middle ISO 7 Buffer room, the innermost ISO 7 cleanroom, and its containing ISO 5 Biosafety Cabinets for Cleanroom 114 was performed on 30 Aug 2026, as per MICRO-SOP-9 (Cleaning and Disinfecting Procedure for Microbiology). During cleaning, it was documented that all H2O2 indicators passed and met the applicable acceptance criteria.</w:t>
               <w:br/>
               <w:t xml:space="preserve"/>
               <w:br/>
@@ -9929,23 +9929,19 @@
               <w:br/>
               <w:t xml:space="preserve"/>
               <w:br/>
-              <w:t xml:space="preserve">Weekly active air sampling of Cleanroom Suite 114 was performed for both the week of processing (04Sep2026) and the week of aliquoting (10Sep2026). On 04Sep2026 (performed by ISS), 1 CFU was recovered from the outermost ISO 8 anteroom (114) under ETX-260914-0487 (characterized as Gram (+) coccobacilli and Gram (+) rods), while the intermediate ISO 7 buffer room (114A) and innermost ISO 7 cleanroom (114B) showed no microbial recovery (0 CFU). Similarly, on 10Sep2026 (performed by SMO), 1 CFU was recovered from the outermost ISO 8 anteroom (114) under ETX-260921-0520 (identification pending), with 0 CFU in both ISO 7 cleanrooms 114A and 114B. Weekly surface sampling across Suite 114 on both 04Sep2026 and 10Sep2026 demonstrated no microbial recovery (0 CFU) across all evaluated locations (Table 114, Cart 114, Cart 114A, Floor 114A, Cart 114B, Floor 114B).</w:t>
+              <w:t xml:space="preserve">Personnel monitoring, ISO 5 BSC surface monitoring, and ISO 5 settling plates collected on the respective processing (01Sep2026) and aliquoting (08Sep2026) dates showed no microbial recovery (0 CFU). Weekly active-air monitoring performed for the corresponding weeks identified 1 CFU in the outermost ISO 8 anteroom (114) on 04Sep2026 (under ETX-260914-0487, characterized as Gram (+) coccobacilli and Gram (+) rods) and 1 CFU in the same classified area on 10Sep2026 (under ETX-260921-0520, identification currently in progress); no microbial recovery was observed from the ISO 7 cleanrooms (114A and 114B) during either weekly active-air monitoring event. Weekly surface sampling across Suite 114 on both dates likewise demonstrated no microbial recovery across all evaluated locations. These data did not identify microbial recovery within the monitored ISO 5 critical processing areas or from the personnel monitoring associated with the testing activities.</w:t>
               <w:br/>
               <w:t xml:space="preserve"/>
               <w:br/>
-              <w:t xml:space="preserve">All sample processing and aliquoting activities were performed within validated ISO 5 Biological Safety Cabinets (BSCs) E001316 and E001798, located in ISO 7 cleanrooms 114B and 114A, respectively. Furthermore, the test samples and media do not come into direct contact with the anteroom air or room surfaces at any stage of the testing process. Samples and media are prepared and transferred in disinfected, lidded containers and transported on carts within the controlled environments. Therefore, the single environmental monitoring recoveries from the outermost ISO 8 anteroom (114) originated from an area that is physically segregated from the controlled ISO 5 environments where the test sample was handled and processed.</w:t>
+              <w:t xml:space="preserve">All sample processing and aliquoting activities were performed within validated ISO 5 Biological Safety Cabinets (BSCs E001316 and E001798), located in ISO 7 cleanrooms 114B and 114A. The sample containers and media remained enclosed and protected during transfer through the ISO 8 anteroom and were not directly exposed to ISO 8 room air. Because no organism was recovered from ETX-260828-0527 during subsequent subculture, a direct microbiological comparison between the OOS sample and the ISO 8 environmental recoveries could not be performed. The ISO 8 findings therefore cannot be microbiologically linked to, or definitively excluded as related to, the OOS result on the basis of organism identification. Nevertheless, review of the enclosed material-transfer process, same-day ISO 5 and personnel monitoring (0 CFU), and facility airflow segregation records did not identify evidence linking the OOS result to the monitored laboratory environment.</w:t>
               <w:br/>
               <w:t xml:space="preserve"/>
               <w:br/>
-              <w:t xml:space="preserve">The complete absence of microbial recovery from analyst glove plates, settling plates, and ISO 5 critical work surfaces throughout both processing and aliquoting indicates that no identifiable contamination transfer pathway existed between the room environment and the ISO 5 processing areas. Furthermore, the subculture of positive sample ETX-260828-0527 under ETX-260908-0593 yielded no microbial growth (0 CFU) with no cellular morphology visualized during differential staining. Therefore, based on the absence of microbial recovery within the critical ISO 5 processing environments, satisfactory environmental monitoring results for personnel and critical surfaces, and the controlled processing conditions maintained throughout testing, the analyst or cleanroom environment is not considered a likely source of contamination for the sample.</w:t>
+              <w:t xml:space="preserve">All interviewed analysts reported following cleaning and handling procedures in accordance with MICRO-SOP-9 and MICRO-SOP-44. A review of the available records and facility monitoring data did not identify documented procedural deviations or abnormal equipment parameters during the processing and aliquoting activities.</w:t>
               <w:br/>
               <w:t xml:space="preserve"/>
               <w:br/>
-              <w:t xml:space="preserve">All analysts confirmed full compliance with cleaning procedures as outlined in SOPs MICRO-SOP-9 (Cleaning and Disinfecting Procedure for Microbiology) and MICRO-SOP-44 (Celsis Sterility Testing). A review of the available data confirms that the cleanroom and equipment conditions remained within acceptable parameters. No deviations or obvious signs of laboratory error during processing and aliquoting were noted from analysts.</w:t>
-              <w:br/>
-              <w:t xml:space="preserve"/>
-              <w:br/>
-              <w:t xml:space="preserve">To assess the potential for sample-to-sample contamination contributing to the positive results, a comprehensive review was conducted of all samples processed on the same day. ETX-260828-0527 was the 1st sample processed in the batch by processing analyst - GS - on 01 Sep 2026. No other sample processed by GS on that date was found to be positive for microbial growth. A review of all other samples processed, incubated, aliquoted, and read within the same testing batch demonstrated no evidence of microbial growth. The absence of additional positive results within the batch confirms that cross-contamination between samples is unlikely during both the processing and the aliquoting steps.</w:t>
+              <w:t xml:space="preserve">ETX-260828-0527 was the first sample processed by analyst GS on 01 Sep 2026. A review of the remaining samples processed by GS that day and of the other samples processed, incubated, aliquoted, and read within the associated testing batch identified no additional positive Celsis results. Accordingly, the reviewed batch data did not identify a pattern supporting sample-to-sample cross-contamination during processing or aliquoting.</w:t>
               <w:br/>
               <w:t xml:space="preserve"/>
               <w:br/>
@@ -9957,7 +9953,7 @@
               <w:br/>
               <w:t xml:space="preserve"/>
               <w:br/>
-              <w:t xml:space="preserve">Based on the observations outlined above, there is no clear indication that the contamination originated from reagents, supplies, the cleanroom environment, or the analyst. Therefore, the results are considered valid, and the likelihood of laboratory error is minimal.</w:t>
+              <w:t xml:space="preserve">Based on the laboratory investigation, no assignable laboratory cause was identified involving the analyst, instrument, reagents, supplies, or monitored laboratory environment. The initial Celsis OOS result therefore remains valid in accordance with the applicable laboratory OOS procedure. Subsequent microbial identification testing did not recover an organism; consequently, the organism identity and source of the positive result could not be determined within the laboratory investigation. Further investigation and disposition, if required, should be performed in accordance with the applicable OOS procedure and client quality requirements.</w:t>
             </w:r>
           </w:p>
           <w:p>

</xml_diff>

<commit_message>
fix(narrative): lock suitability record colon and eliminate redundant positive container ID in prose
</commit_message>
<xml_diff>
--- a/scratch/OOS-262080 Optimal Balance Pharmacy (E19193) - Celsis.docx
+++ b/scratch/OOS-262080 Optimal Balance Pharmacy (E19193) - Celsis.docx
@@ -9878,13 +9878,13 @@
               <w:t>The innermost ISO 7 cleanroom 114B and its ISO 5 BSC E001316 were thoroughly cleaned and prepared before initiating testing by analyst Gabrielle Surber as per MICRO-SOP-2 (Environmental Monitoring of the Clean Room Facility) and MICRO-SOP-9 (Cleaning and Disinfecting Procedure for Microbiology). For Celsis aliquoting, intermediate ISO 7 buffer room 114A and its ISO 5 BSC E001798 were thoroughly cleaned and prepared by analyst Cuong Du before initiating testing as per MICRO-SOP-44 and MICRO-SOP-9. Both BSCs, E001316 in 114B and E001798 in 114A, were certified and approved by the Engineering and Quality Assurance teams prior to use.</w:t>
               <w:br/>
               <w:br/>
-              <w:t>On 01 Sep 2026, the sample vials for ETX-260828-0527 were received from the Sample Submissions team and brought into the Sterile Microbiology lab. Upon arrival, each vial was sprayed with an acidified bleach disinfectant, placed into pre-disinfected bins, and allowed a 10-minute contact time. Secondary disinfection was performed in the ISO 8 anteroom (114), where the vials were again treated with acidified bleach with a 10-minute contact time before transfer into cleanroom 114B. Inside 114B, processing analyst Gabrielle Surber performed a final disinfection step with a 10-minute contact time. Once fully disinfected, the vials were transferred into the ISO 5 BSC E001316, placed on the disinfected work surface, aseptically opened, and tested in accordance with MICRO-SOP-44. Direct inoculation was performed by adding 25 mL of sample per media type, using five 300 mL FTM jars and five 300 mL TSB jars. In accordance with suitability method record 2601120497, one gram of Bovine Serum Albumin was prepared in 100 mL of PBS, and 5 mL of this solution was added to each jar. Following testing, the media bottles were transferred into incubators E001356 and E001357 to initiate incubation.</w:t>
+              <w:t>On 01 Sep 2026, the sample vials for ETX-260828-0527 were received from the Sample Submissions team and brought into the Sterile Microbiology lab. Upon arrival, each vial was sprayed with an acidified bleach disinfectant, placed into pre-disinfected bins, and allowed a 10-minute contact time. Secondary disinfection was performed in the ISO 8 anteroom (114), where the vials were again treated with acidified bleach with a 10-minute contact time before transfer into cleanroom 114B. Inside 114B, processing analyst Gabrielle Surber performed a final disinfection step with a 10-minute contact time. Once fully disinfected, the vials were transferred into the ISO 5 BSC E001316, placed on the disinfected work surface, aseptically opened, and tested in accordance with MICRO-SOP-44. Direct inoculation was performed by adding 25 mL of sample per media type, using five 300 mL FTM jars and five 300 mL TSB jars. In accordance with suitability method record: 2601120497, one gram of Bovine Serum Albumin was prepared in 100 mL of PBS, and 5 mL of this solution was added to each jar. Following testing, the media bottles were transferred into incubators E001356 and E001357 to initiate incubation.</w:t>
               <w:br/>
               <w:br/>
               <w:t>Upon completion of incubation on 08 Sep 2026, the media bottles for ETX-260828-0527 were disinfected and transferred to the middle ISO 7 buffer room (114A) for the aliquoting step per MICRO-SOP-44 (Celsis Sterility Testing). In cleanroom 114A, the media bottles were disinfected one more time before transfer into the ISO 5 BSC E001798 located in cleanroom 114A. In ISO 5 BSC E001798, the sample was aliquoted into assay cuvettes by analyst Cuong Du. Following aliquoting, Celsis Sterility Reading was performed in accordance with MICRO-SOP-44 by analyst America Alanis.</w:t>
               <w:br/>
               <w:br/>
-              <w:t>Following the reading, sample ETX-260828-0527 was found to yield a positive reading in one of the 300 mL FTM media jars (ETX-260828-0527-3/5). The average Relative Luminescence Units (RLU) from the duplicate reading tube, originating from the FTM sample bottle, yielded 7,190 RLU, which exceeded the method cutoff of 2,955 RLU, where the FTM negative control was 985 RLU. All other FTM and TSB sample bottles in the same batch tested negative. The %CV from the duplicate reading tubes for the positive FTM bottles was well within the specification ( 30%). Additionally, all Daily Controls, including the Instrument Blank, Reagent Blank, and ATP Positive Control, were within the defined specifications, each with a %CV below 30%.</w:t>
+              <w:t>Following the reading, sample ETX-260828-0527 was found to yield a positive reading in one of the 300 mL FTM media jars. The average Relative Luminescence Units (RLU) from the duplicate reading tube, originating from the FTM sample bottle, yielded 7,190 RLU, which exceeded the method cutoff of 2,955 RLU, where the FTM negative control was 985 RLU. All other FTM and TSB sample bottles in the same batch tested negative. The %CV from the duplicate reading tubes for the positive FTM bottles was well within the specification ( 30%). Additionally, all Daily Controls, including the Instrument Blank, Reagent Blank, and ATP Positive Control, were within the defined specifications, each with a %CV below 30%.</w:t>
               <w:br/>
               <w:br/>
               <w:t>Following the OOS result, the positive FTM bottle for ETX-260828-0527 was submitted for Differential Staining and Microbial Identification under ETX-260908-0593. No microbial growth was recovered by subculture, with zero CFU observed on the plate as shown in Table 1, and no cellular morphology was visualized by differential staining. Therefore, no organism was recovered for identification or further microbiological comparison. The lack of recovery on subculture does not invalidate the initial analytical Celsis result and may be consistent with low-level or stressed microbial cells under the test conditions, though a specific physiological state could not be confirmed.</w:t>

</xml_diff>

<commit_message>
fix(celsis): correct Table 1 and narrative to reflect 2 positive FTM jars (3rd and 5th jars)
</commit_message>
<xml_diff>
--- a/scratch/OOS-262080 Optimal Balance Pharmacy (E19193) - Celsis.docx
+++ b/scratch/OOS-262080 Optimal Balance Pharmacy (E19193) - Celsis.docx
@@ -9884,10 +9884,10 @@
               <w:t>Upon completion of incubation on 08 Sep 2026, the media bottles for ETX-260828-0527 were disinfected and transferred to the middle ISO 7 buffer room (114A) for the aliquoting step per MICRO-SOP-44 (Celsis Sterility Testing). In cleanroom 114A, the media bottles were disinfected one more time before transfer into the ISO 5 BSC E001798 located in cleanroom 114A. In ISO 5 BSC E001798, the sample was aliquoted into assay cuvettes by analyst Cuong Du. Following aliquoting, Celsis Sterility Reading was performed in accordance with MICRO-SOP-44 by analyst America Alanis.</w:t>
               <w:br/>
               <w:br/>
-              <w:t>Following the reading, sample ETX-260828-0527 was found to yield a positive reading in one of the 300 mL FTM media jars. The average Relative Luminescence Units (RLU) from the duplicate reading tube, originating from the FTM sample bottle, yielded 7,190 RLU, which exceeded the method cutoff of 2,955 RLU, where the FTM negative control was 985 RLU. All other FTM and TSB sample bottles in the same batch tested negative. The %CV from the duplicate reading tubes for the positive FTM bottles was well within the specification ( 30%). Additionally, all Daily Controls, including the Instrument Blank, Reagent Blank, and ATP Positive Control, were within the defined specifications, each with a %CV below 30%.</w:t>
+              <w:t>Following the reading, sample ETX-260828-0527 was found to yield a positive reading in two of the 300 mL FTM media jars (the 3rd and 5th jars). The average Relative Luminescence Units (RLU) from the duplicate reading tube, originating from the positive FTM sample bottles, yielded 7,190 RLU, which exceeded the method cutoff of 2,955 RLU, where the FTM negative control was 985 RLU. All other FTM and TSB sample bottles in the same batch tested negative. The %CV from the duplicate reading tubes for the positive FTM bottles was well within the specification ( 30%). Additionally, all Daily Controls, including the Instrument Blank, Reagent Blank, and ATP Positive Control, were within the defined specifications, each with a %CV below 30%.</w:t>
               <w:br/>
               <w:br/>
-              <w:t>Following the OOS result, the positive FTM bottle for ETX-260828-0527 was submitted for Differential Staining and Microbial Identification under ETX-260908-0593. No microbial growth was recovered by subculture, with zero CFU observed on the plate as shown in Table 1, and no cellular morphology was visualized by differential staining. Therefore, no organism was recovered for identification or further microbiological comparison. The lack of recovery on subculture does not invalidate the initial analytical Celsis result and may be consistent with low-level or stressed microbial cells under the test conditions, though a specific physiological state could not be confirmed.</w:t>
+              <w:t>Following the OOS result, the positive FTM bottles for ETX-260828-0527 were submitted for Differential Staining and Microbial Identification under ETX-260908-0593. No microbial growth was recovered by subculture, with zero CFU observed on the plate as shown in Table 1, and no cellular morphology was visualized by differential staining. Therefore, no organism was recovered for identification or further microbiological comparison. The lack of recovery on subculture does not invalidate the initial analytical Celsis result and may be consistent with low-level or stressed microbial cells under the test conditions, though a specific physiological state could not be confirmed.</w:t>
               <w:br/>
               <w:br/>
               <w:t>The culture media utilized were within their expiry period. The negative culture media bottles for the direct inoculation method for the original culture were handled, processed, and incubated in a manner identical to that of actual samples. No microbial growth was observed in the corresponding negative control.</w:t>
@@ -9914,7 +9914,7 @@
               <w:t>All analysts confirmed full compliance with cleaning procedures as outlined in MICRO-SOP-9 (Cleaning and Disinfecting Procedure for Microbiology) and MICRO-SOP-44 (Celsis Sterility Testing). A review of the available data confirms that the cleanroom and equipment conditions remained within acceptable parameters. No deviations or obvious signs of laboratory error during processing and aliquoting were noted from analysts.</w:t>
               <w:br/>
               <w:br/>
-              <w:t>No other sample processed by analyst Gabrielle Surber on 01 Sep 2026 and aliquoted by analyst Cuong Du on 08 Sep 2026, failed Celsis Sterility testing that day. To assess the potential for sample-to-sample contamination contributing to the positive results, a comprehensive review was conducted of all samples processed in the same batch. All other samples processed by the same analyst on the day of testing were found to test negative for microbial growth. These findings suggest that cross-contamination between samples is unlikely.</w:t>
+              <w:t>No other sample processed by analyst Gabrielle Surber on 01 Sep 2026 and aliquoted by analyst Cuong Du on 08 Sep 2026, failed Celsis Sterility testing that day. To assess the potential for sample-to-sample contamination contributing to the positive results, a comprehensive review was conducted of all samples processed in the same batch. It was the 1st sample processed from the batch of samples (with the 3rd and 5th jars found positive). All other samples processed by the same analyst on the day of testing were found to test negative for microbial growth. These findings suggest that cross-contamination between samples is unlikely.</w:t>
               <w:br/>
               <w:br/>
               <w:t>Analyzing a 6-month sample history for Optimal Balance Pharmacy indicates, this specific analyte "MOTs-C 10 MG/ML (5 ML) Injection" has had no prior failures using the Celsis Sterility testing during this period.</w:t>

</xml_diff>